<commit_message>
Fix guide TOC rendering and replace GFM tables with plain lists
Replace the corrected Complete User Guide assets in place:
- frontend/src/resources/markdown/complete-user-guide.md — eight-roles table
  and the appendix permission matrix converted from GFM tables to plain
  bullet lists (react-markdown renders these reliably without GFM table
  support); TOC rendering fix carried in the .docx.
- frontend/public/resources/complete-user-guide.docx — matching corrected
  downloadable Word file.

Asset replacement only: no manifest/index.js or other source changes.

🤖 Generated with Claude Code
Co-Authored-By: Claude <noreply@anthropic.com>
</commit_message>
<xml_diff>
--- a/frontend/public/resources/complete-user-guide.docx
+++ b/frontend/public/resources/complete-user-guide.docx
@@ -76,25 +76,366 @@
         <w:t xml:space="preserve">Contents</w:t>
       </w:r>
     </w:p>
-    <w:sdt>
-      <w:sdtPr>
-        <w:alias w:val="Contents"/>
-      </w:sdtPr>
-      <w:sdtContent>
-        <w:p>
-          <w:r>
-            <w:fldChar w:fldCharType="begin" w:dirty="true"/>
-            <w:instrText xml:space="preserve">TOC \h \o "1-1"</w:instrText>
-            <w:fldChar w:fldCharType="separate"/>
-          </w:r>
-        </w:p>
-        <w:p>
-          <w:r>
-            <w:fldChar w:fldCharType="end"/>
-          </w:r>
-        </w:p>
-      </w:sdtContent>
-    </w:sdt>
+    <w:p>
+      <w:pPr>
+        <w:tabs>
+          <w:tab w:val="left" w:pos="620"/>
+        </w:tabs>
+        <w:spacing w:after="110" w:line="276"/>
+        <w:ind w:left="200"/>
+      </w:pPr>
+      <w:r>
+        <w:rPr>
+          <w:b/>
+          <w:bCs/>
+          <w:color w:val="2E75B6"/>
+        </w:rPr>
+        <w:t xml:space="preserve">1.</w:t>
+      </w:r>
+      <w:r>
+        <w:t xml:space="preserve">	About this guide</w:t>
+      </w:r>
+    </w:p>
+    <w:p>
+      <w:pPr>
+        <w:tabs>
+          <w:tab w:val="left" w:pos="620"/>
+        </w:tabs>
+        <w:spacing w:after="110" w:line="276"/>
+        <w:ind w:left="200"/>
+      </w:pPr>
+      <w:r>
+        <w:rPr>
+          <w:b/>
+          <w:bCs/>
+          <w:color w:val="2E75B6"/>
+        </w:rPr>
+        <w:t xml:space="preserve">2.</w:t>
+      </w:r>
+      <w:r>
+        <w:t xml:space="preserve">	Getting started: signing in and finding your way around</w:t>
+      </w:r>
+    </w:p>
+    <w:p>
+      <w:pPr>
+        <w:tabs>
+          <w:tab w:val="left" w:pos="620"/>
+        </w:tabs>
+        <w:spacing w:after="110" w:line="276"/>
+        <w:ind w:left="200"/>
+      </w:pPr>
+      <w:r>
+        <w:rPr>
+          <w:b/>
+          <w:bCs/>
+          <w:color w:val="2E75B6"/>
+        </w:rPr>
+        <w:t xml:space="preserve">3.</w:t>
+      </w:r>
+      <w:r>
+        <w:t xml:space="preserve">	The Dashboard</w:t>
+      </w:r>
+    </w:p>
+    <w:p>
+      <w:pPr>
+        <w:tabs>
+          <w:tab w:val="left" w:pos="620"/>
+        </w:tabs>
+        <w:spacing w:after="110" w:line="276"/>
+        <w:ind w:left="200"/>
+      </w:pPr>
+      <w:r>
+        <w:rPr>
+          <w:b/>
+          <w:bCs/>
+          <w:color w:val="2E75B6"/>
+        </w:rPr>
+        <w:t xml:space="preserve">4.</w:t>
+      </w:r>
+      <w:r>
+        <w:t xml:space="preserve">	Students and the student record</w:t>
+      </w:r>
+    </w:p>
+    <w:p>
+      <w:pPr>
+        <w:tabs>
+          <w:tab w:val="left" w:pos="620"/>
+        </w:tabs>
+        <w:spacing w:after="110" w:line="276"/>
+        <w:ind w:left="200"/>
+      </w:pPr>
+      <w:r>
+        <w:rPr>
+          <w:b/>
+          <w:bCs/>
+          <w:color w:val="2E75B6"/>
+        </w:rPr>
+        <w:t xml:space="preserve">5.</w:t>
+      </w:r>
+      <w:r>
+        <w:t xml:space="preserve">	Screeners (MAP and STAR)</w:t>
+      </w:r>
+    </w:p>
+    <w:p>
+      <w:pPr>
+        <w:tabs>
+          <w:tab w:val="left" w:pos="620"/>
+        </w:tabs>
+        <w:spacing w:after="110" w:line="276"/>
+        <w:ind w:left="200"/>
+      </w:pPr>
+      <w:r>
+        <w:rPr>
+          <w:b/>
+          <w:bCs/>
+          <w:color w:val="2E75B6"/>
+        </w:rPr>
+        <w:t xml:space="preserve">6.</w:t>
+      </w:r>
+      <w:r>
+        <w:t xml:space="preserve">	Intervention plans and the Intervention Menu</w:t>
+      </w:r>
+    </w:p>
+    <w:p>
+      <w:pPr>
+        <w:tabs>
+          <w:tab w:val="left" w:pos="620"/>
+        </w:tabs>
+        <w:spacing w:after="110" w:line="276"/>
+        <w:ind w:left="200"/>
+      </w:pPr>
+      <w:r>
+        <w:rPr>
+          <w:b/>
+          <w:bCs/>
+          <w:color w:val="2E75B6"/>
+        </w:rPr>
+        <w:t xml:space="preserve">7.</w:t>
+      </w:r>
+      <w:r>
+        <w:t xml:space="preserve">	Progress monitoring and overdue-log reminders</w:t>
+      </w:r>
+    </w:p>
+    <w:p>
+      <w:pPr>
+        <w:tabs>
+          <w:tab w:val="left" w:pos="620"/>
+        </w:tabs>
+        <w:spacing w:after="110" w:line="276"/>
+        <w:ind w:left="200"/>
+      </w:pPr>
+      <w:r>
+        <w:rPr>
+          <w:b/>
+          <w:bCs/>
+          <w:color w:val="2E75B6"/>
+        </w:rPr>
+        <w:t xml:space="preserve">8.</w:t>
+      </w:r>
+      <w:r>
+        <w:t xml:space="preserve">	MTSS meetings and the referral process</w:t>
+      </w:r>
+    </w:p>
+    <w:p>
+      <w:pPr>
+        <w:tabs>
+          <w:tab w:val="left" w:pos="620"/>
+        </w:tabs>
+        <w:spacing w:after="110" w:line="276"/>
+        <w:ind w:left="200"/>
+      </w:pPr>
+      <w:r>
+        <w:rPr>
+          <w:b/>
+          <w:bCs/>
+          <w:color w:val="2E75B6"/>
+        </w:rPr>
+        <w:t xml:space="preserve">9.</w:t>
+      </w:r>
+      <w:r>
+        <w:t xml:space="preserve">	Tier 1 tools and Resources</w:t>
+      </w:r>
+    </w:p>
+    <w:p>
+      <w:pPr>
+        <w:tabs>
+          <w:tab w:val="left" w:pos="620"/>
+        </w:tabs>
+        <w:spacing w:after="110" w:line="276"/>
+        <w:ind w:left="200"/>
+      </w:pPr>
+      <w:r>
+        <w:rPr>
+          <w:b/>
+          <w:bCs/>
+          <w:color w:val="2E75B6"/>
+        </w:rPr>
+        <w:t xml:space="preserve">10.</w:t>
+      </w:r>
+      <w:r>
+        <w:t xml:space="preserve">	Discipline referrals</w:t>
+      </w:r>
+    </w:p>
+    <w:p>
+      <w:pPr>
+        <w:tabs>
+          <w:tab w:val="left" w:pos="620"/>
+        </w:tabs>
+        <w:spacing w:after="110" w:line="276"/>
+        <w:ind w:left="200"/>
+      </w:pPr>
+      <w:r>
+        <w:rPr>
+          <w:b/>
+          <w:bCs/>
+          <w:color w:val="2E75B6"/>
+        </w:rPr>
+        <w:t xml:space="preserve">11.</w:t>
+      </w:r>
+      <w:r>
+        <w:t xml:space="preserve">	Discipline Reports and demographics</w:t>
+      </w:r>
+    </w:p>
+    <w:p>
+      <w:pPr>
+        <w:tabs>
+          <w:tab w:val="left" w:pos="620"/>
+        </w:tabs>
+        <w:spacing w:after="110" w:line="276"/>
+        <w:ind w:left="200"/>
+      </w:pPr>
+      <w:r>
+        <w:rPr>
+          <w:b/>
+          <w:bCs/>
+          <w:color w:val="2E75B6"/>
+        </w:rPr>
+        <w:t xml:space="preserve">12.</w:t>
+      </w:r>
+      <w:r>
+        <w:t xml:space="preserve">	Grade Roll-up (end of year)</w:t>
+      </w:r>
+    </w:p>
+    <w:p>
+      <w:pPr>
+        <w:tabs>
+          <w:tab w:val="left" w:pos="620"/>
+        </w:tabs>
+        <w:spacing w:after="110" w:line="276"/>
+        <w:ind w:left="200"/>
+      </w:pPr>
+      <w:r>
+        <w:rPr>
+          <w:b/>
+          <w:bCs/>
+          <w:color w:val="2E75B6"/>
+        </w:rPr>
+        <w:t xml:space="preserve">13.</w:t>
+      </w:r>
+      <w:r>
+        <w:t xml:space="preserve">	Section 504 plans and accommodations</w:t>
+      </w:r>
+    </w:p>
+    <w:p>
+      <w:pPr>
+        <w:tabs>
+          <w:tab w:val="left" w:pos="620"/>
+        </w:tabs>
+        <w:spacing w:after="110" w:line="276"/>
+        <w:ind w:left="200"/>
+      </w:pPr>
+      <w:r>
+        <w:rPr>
+          <w:b/>
+          <w:bCs/>
+          <w:color w:val="2E75B6"/>
+        </w:rPr>
+        <w:t xml:space="preserve">14.</w:t>
+      </w:r>
+      <w:r>
+        <w:t xml:space="preserve">	The parent / guardian portal</w:t>
+      </w:r>
+    </w:p>
+    <w:p>
+      <w:pPr>
+        <w:tabs>
+          <w:tab w:val="left" w:pos="620"/>
+        </w:tabs>
+        <w:spacing w:after="110" w:line="276"/>
+        <w:ind w:left="200"/>
+      </w:pPr>
+      <w:r>
+        <w:rPr>
+          <w:b/>
+          <w:bCs/>
+          <w:color w:val="2E75B6"/>
+        </w:rPr>
+        <w:t xml:space="preserve">15.</w:t>
+      </w:r>
+      <w:r>
+        <w:t xml:space="preserve">	Admin and settings</w:t>
+      </w:r>
+    </w:p>
+    <w:p>
+      <w:pPr>
+        <w:tabs>
+          <w:tab w:val="left" w:pos="620"/>
+        </w:tabs>
+        <w:spacing w:after="110" w:line="276"/>
+        <w:ind w:left="200"/>
+      </w:pPr>
+      <w:r>
+        <w:rPr>
+          <w:b/>
+          <w:bCs/>
+          <w:color w:val="2E75B6"/>
+        </w:rPr>
+        <w:t xml:space="preserve">16.</w:t>
+      </w:r>
+      <w:r>
+        <w:t xml:space="preserve">	Protecting student data</w:t>
+      </w:r>
+    </w:p>
+    <w:p>
+      <w:pPr>
+        <w:tabs>
+          <w:tab w:val="left" w:pos="620"/>
+        </w:tabs>
+        <w:spacing w:after="110" w:line="276"/>
+        <w:ind w:left="200"/>
+      </w:pPr>
+      <w:r>
+        <w:rPr>
+          <w:b/>
+          <w:bCs/>
+          <w:color w:val="2E75B6"/>
+        </w:rPr>
+        <w:t xml:space="preserve">17.</w:t>
+      </w:r>
+      <w:r>
+        <w:t xml:space="preserve">	Quick answers</w:t>
+      </w:r>
+    </w:p>
+    <w:p>
+      <w:pPr>
+        <w:tabs>
+          <w:tab w:val="left" w:pos="620"/>
+        </w:tabs>
+        <w:spacing w:after="110" w:line="276"/>
+        <w:ind w:left="200"/>
+      </w:pPr>
+      <w:r>
+        <w:rPr>
+          <w:b/>
+          <w:bCs/>
+          <w:color w:val="2E75B6"/>
+        </w:rPr>
+        <w:t xml:space="preserve">18.</w:t>
+      </w:r>
+      <w:r>
+        <w:t xml:space="preserve">	Appendix: role-permission matrix</w:t>
+      </w:r>
+    </w:p>
     <w:p>
       <w:pPr>
         <w:pageBreakBefore/>

</xml_diff>

<commit_message>
chore(resources): update Complete User Guide for calendar-aware reminders
Refresh the in-app Complete User Guide so it reflects the calendar- and
frequency-aware overdue-log reminders (M052 + PRs #348/#350):

- Replace the .docx download (frontend/public/resources/complete-user-guide.docx).
- Sync the preview markdown:
  - "When is a log overdue?": expected-window wording + biweekly cadence note
  - "About overdue logic." note body: calendar + frequency awareness, applies
    to email and the Weekly Reminder card
  - FAQ "still overdue when school is out?": breaks pause the check
  - New Section 7 subsection "The academic calendar." describing the
    school_admin Academic calendar card

Content/docs only — no PII, no tenant/auth/code paths touched.

🤖 Generated with Claude Code
Co-Authored-By: Claude <noreply@anthropic.com>
</commit_message>
<xml_diff>
--- a/frontend/public/resources/complete-user-guide.docx
+++ b/frontend/public/resources/complete-user-guide.docx
@@ -4087,7 +4087,7 @@
         <w:t xml:space="preserve">Note only</w:t>
       </w:r>
       <w:r>
-        <w:t xml:space="preserve"> intervention), and no progress has been logged for the current week (weeks start on Monday).</w:t>
+        <w:t xml:space="preserve"> intervention), and no progress has been logged within the expected window (weeks start on Monday). For most plans that means the current week; for plans on a biweekly cadence, a log in either the current or the prior week keeps it current.</w:t>
       </w:r>
     </w:p>
     <w:tbl>
@@ -4141,7 +4141,7 @@
               <w:spacing w:after="0"/>
             </w:pPr>
             <w:r>
-              <w:t xml:space="preserve">The overdue check looks at the calendar week, not each intervention’s stated frequency — so the frequency shown on a plan is informational. Because the rule has no end-of-term cutoff, an intervention left </w:t>
+              <w:t xml:space="preserve">The overdue check now respects two things it used to ignore: your school’s academic calendar and each plan’s logging frequency. Reminders pause during the term breaks your school has entered (see The academic calendar, below), so an intervention left </w:t>
             </w:r>
             <w:r>
               <w:rPr>
@@ -4151,7 +4151,7 @@
               <w:t xml:space="preserve">active</w:t>
             </w:r>
             <w:r>
-              <w:t xml:space="preserve"> over a school break can keep flagging as overdue until it’s completed or archived. Closing out finished interventions keeps your reminders meaningful.</w:t>
+              <w:t xml:space="preserve"> over a break won’t keep flagging until classes resume, and a biweekly plan isn’t counted overdue in an off week. This applies to both the reminder email and the Weekly Reminder: Log Progress card on the dashboard. Closing out finished interventions still keeps your reminders meaningful.</w:t>
             </w:r>
           </w:p>
         </w:tc>
@@ -4217,6 +4217,122 @@
       </w:r>
       <w:r>
         <w:t xml:space="preserve">, so you only need to act if you want to stop the emails. District admins can make the same change for a whole district or a single school, and the platform support team can do it by request. (A separate, more detailed guide on this reminder is also available.)</w:t>
+      </w:r>
+    </w:p>
+    <w:p>
+      <w:pPr>
+        <w:pStyle w:val="Heading2"/>
+      </w:pPr>
+      <w:r>
+        <w:t xml:space="preserve">The academic calendar</w:t>
+      </w:r>
+    </w:p>
+    <w:p>
+      <w:pPr>
+        <w:spacing w:after="120" w:line="276"/>
+      </w:pPr>
+      <w:r>
+        <w:t xml:space="preserve">School admins set their building’s term and break dates from the </w:t>
+      </w:r>
+      <w:r>
+        <w:rPr>
+          <w:b/>
+          <w:bCs/>
+        </w:rPr>
+        <w:t xml:space="preserve">Academic calendar</w:t>
+      </w:r>
+      <w:r>
+        <w:t xml:space="preserve"> card in Admin settings, and the overdue-log reminders use those dates to pause during breaks. Choose </w:t>
+      </w:r>
+      <w:r>
+        <w:rPr>
+          <w:b/>
+          <w:bCs/>
+        </w:rPr>
+        <w:t xml:space="preserve">Add</w:t>
+      </w:r>
+      <w:r>
+        <w:t xml:space="preserve">, set the </w:t>
+      </w:r>
+      <w:r>
+        <w:rPr>
+          <w:b/>
+          <w:bCs/>
+        </w:rPr>
+        <w:t xml:space="preserve">Type</w:t>
+      </w:r>
+      <w:r>
+        <w:t xml:space="preserve"> (</w:t>
+      </w:r>
+      <w:r>
+        <w:rPr>
+          <w:b/>
+          <w:bCs/>
+        </w:rPr>
+        <w:t xml:space="preserve">Term (in session)</w:t>
+      </w:r>
+      <w:r>
+        <w:t xml:space="preserve"> or </w:t>
+      </w:r>
+      <w:r>
+        <w:rPr>
+          <w:b/>
+          <w:bCs/>
+        </w:rPr>
+        <w:t xml:space="preserve">Break (out of session)</w:t>
+      </w:r>
+      <w:r>
+        <w:t xml:space="preserve">), enter a </w:t>
+      </w:r>
+      <w:r>
+        <w:rPr>
+          <w:b/>
+          <w:bCs/>
+        </w:rPr>
+        <w:t xml:space="preserve">Start date</w:t>
+      </w:r>
+      <w:r>
+        <w:t xml:space="preserve"> and </w:t>
+      </w:r>
+      <w:r>
+        <w:rPr>
+          <w:b/>
+          <w:bCs/>
+        </w:rPr>
+        <w:t xml:space="preserve">End date</w:t>
+      </w:r>
+      <w:r>
+        <w:t xml:space="preserve">, add an optional </w:t>
+      </w:r>
+      <w:r>
+        <w:rPr>
+          <w:b/>
+          <w:bCs/>
+        </w:rPr>
+        <w:t xml:space="preserve">Label</w:t>
+      </w:r>
+      <w:r>
+        <w:t xml:space="preserve"> (such as “Winter Break”), then </w:t>
+      </w:r>
+      <w:r>
+        <w:rPr>
+          <w:b/>
+          <w:bCs/>
+        </w:rPr>
+        <w:t xml:space="preserve">Add entry</w:t>
+      </w:r>
+      <w:r>
+        <w:t xml:space="preserve">. Edit a row with the pencil icon and </w:t>
+      </w:r>
+      <w:r>
+        <w:rPr>
+          <w:b/>
+          <w:bCs/>
+        </w:rPr>
+        <w:t xml:space="preserve">Save changes</w:t>
+      </w:r>
+      <w:r>
+        <w:t xml:space="preserve">, or remove it with the trash icon. Keeping the calendar current keeps reminders aligned with your school year.</w:t>
       </w:r>
     </w:p>
     <w:p>
@@ -7072,7 +7188,7 @@
         <w:spacing w:after="120" w:line="276"/>
       </w:pPr>
       <w:r>
-        <w:t xml:space="preserve">The overdue check flags any active, monitored intervention that hasn’t been logged this week, with no automatic pause for breaks. If a student’s work is genuinely finished, mark the intervention complete or archive the student so it stops flagging.</w:t>
+        <w:t xml:space="preserve">The overdue check now pauses during the term breaks your school has entered in its academic calendar (in Admin settings), so active interventions stop flagging while school is out and resume when classes return. During session, if a student’s work is genuinely finished, mark the intervention complete or archive the student so it stops flagging.</w:t>
       </w:r>
     </w:p>
     <w:p>

</xml_diff>